<commit_message>
Final proofreading pass: table labels, caption, minus signs, limitation wording
- Limitations no longer contradict the leave-one-cultivar-out result
- Short column labels (M-instr., M-pop.) so table headers do not break mid-word
- Table 1 prints a single value instead of degenerate ranges
- Fig. 3 caption corrected; typographic minus in text, captions and tables
- Rebuilt manuscript (audit 33/33), PDF and supplementary material; review_10 updated

Co-Authored-By: Claude Opus 5.5 <noreply@anthropic.com>
Claude-Session: https://claude.ai/code/session_014xe1tFMeGeZdEUHZhL6f5V
</commit_message>
<xml_diff>
--- a/Target_Journal_Submission/manuscript/Final_Manuscript.docx
+++ b/Target_Journal_Submission/manuscript/Final_Manuscript.docx
@@ -1929,7 +1929,7 @@
                 <w:sz w:val="18"/>
                 <w:szCs w:val="18"/>
               </w:rPr>
-              <w:t xml:space="preserve">6–6</w:t>
+              <w:t xml:space="preserve">6</w:t>
             </w:r>
           </w:p>
         </w:tc>
@@ -2236,7 +2236,7 @@
                 <w:sz w:val="18"/>
                 <w:szCs w:val="18"/>
               </w:rPr>
-              <w:t xml:space="preserve">M-instrument</w:t>
+              <w:t xml:space="preserve">M-instr.</w:t>
             </w:r>
           </w:p>
         </w:tc>
@@ -2472,7 +2472,7 @@
                 <w:sz w:val="18"/>
                 <w:szCs w:val="18"/>
               </w:rPr>
-              <w:t xml:space="preserve">M-population</w:t>
+              <w:t xml:space="preserve">M-pop.</w:t>
             </w:r>
           </w:p>
         </w:tc>
@@ -2873,7 +2873,7 @@
                 <w:sz w:val="18"/>
                 <w:szCs w:val="18"/>
               </w:rPr>
-              <w:t xml:space="preserve">29–29</w:t>
+              <w:t xml:space="preserve">29</w:t>
             </w:r>
           </w:p>
         </w:tc>
@@ -3043,7 +3043,7 @@
                 <w:sz w:val="18"/>
                 <w:szCs w:val="18"/>
               </w:rPr>
-              <w:t xml:space="preserve">120–120</w:t>
+              <w:t xml:space="preserve">120</w:t>
             </w:r>
           </w:p>
         </w:tc>
@@ -3109,7 +3109,7 @@
                 <w:sz w:val="18"/>
                 <w:szCs w:val="18"/>
               </w:rPr>
-              <w:t xml:space="preserve">2–2</w:t>
+              <w:t xml:space="preserve">2</w:t>
             </w:r>
           </w:p>
         </w:tc>
@@ -3279,7 +3279,7 @@
                 <w:sz w:val="18"/>
                 <w:szCs w:val="18"/>
               </w:rPr>
-              <w:t xml:space="preserve">120–120</w:t>
+              <w:t xml:space="preserve">120</w:t>
             </w:r>
           </w:p>
         </w:tc>
@@ -3345,7 +3345,7 @@
                 <w:sz w:val="18"/>
                 <w:szCs w:val="18"/>
               </w:rPr>
-              <w:t xml:space="preserve">2–2</w:t>
+              <w:t xml:space="preserve">2</w:t>
             </w:r>
           </w:p>
         </w:tc>
@@ -3515,7 +3515,7 @@
                 <w:sz w:val="18"/>
                 <w:szCs w:val="18"/>
               </w:rPr>
-              <w:t xml:space="preserve">120–120</w:t>
+              <w:t xml:space="preserve">120</w:t>
             </w:r>
           </w:p>
         </w:tc>
@@ -3581,7 +3581,7 @@
                 <w:sz w:val="18"/>
                 <w:szCs w:val="18"/>
               </w:rPr>
-              <w:t xml:space="preserve">2–2</w:t>
+              <w:t xml:space="preserve">2</w:t>
             </w:r>
           </w:p>
         </w:tc>
@@ -3751,7 +3751,7 @@
                 <w:sz w:val="18"/>
                 <w:szCs w:val="18"/>
               </w:rPr>
-              <w:t xml:space="preserve">120–120</w:t>
+              <w:t xml:space="preserve">120</w:t>
             </w:r>
           </w:p>
         </w:tc>
@@ -3817,7 +3817,7 @@
                 <w:sz w:val="18"/>
                 <w:szCs w:val="18"/>
               </w:rPr>
-              <w:t xml:space="preserve">2–2</w:t>
+              <w:t xml:space="preserve">2</w:t>
             </w:r>
           </w:p>
         </w:tc>
@@ -4086,7 +4086,7 @@
                 <w:sz w:val="18"/>
                 <w:szCs w:val="18"/>
               </w:rPr>
-              <w:t xml:space="preserve">25–25</w:t>
+              <w:t xml:space="preserve">25</w:t>
             </w:r>
           </w:p>
         </w:tc>
@@ -4223,7 +4223,7 @@
                 <w:sz w:val="18"/>
                 <w:szCs w:val="18"/>
               </w:rPr>
-              <w:t xml:space="preserve">19747–19747</w:t>
+              <w:t xml:space="preserve">19747</w:t>
             </w:r>
           </w:p>
         </w:tc>
@@ -4289,7 +4289,7 @@
                 <w:sz w:val="18"/>
                 <w:szCs w:val="18"/>
               </w:rPr>
-              <w:t xml:space="preserve">84–84</w:t>
+              <w:t xml:space="preserve">84</w:t>
             </w:r>
           </w:p>
         </w:tc>
@@ -4322,7 +4322,7 @@
                 <w:sz w:val="18"/>
                 <w:szCs w:val="18"/>
               </w:rPr>
-              <w:t xml:space="preserve">21–21</w:t>
+              <w:t xml:space="preserve">21</w:t>
             </w:r>
           </w:p>
         </w:tc>
@@ -4459,7 +4459,7 @@
                 <w:sz w:val="18"/>
                 <w:szCs w:val="18"/>
               </w:rPr>
-              <w:t xml:space="preserve">195–195</w:t>
+              <w:t xml:space="preserve">195</w:t>
             </w:r>
           </w:p>
         </w:tc>
@@ -4525,7 +4525,7 @@
                 <w:sz w:val="18"/>
                 <w:szCs w:val="18"/>
               </w:rPr>
-              <w:t xml:space="preserve">195–195</w:t>
+              <w:t xml:space="preserve">195</w:t>
             </w:r>
           </w:p>
         </w:tc>
@@ -4558,7 +4558,7 @@
                 <w:sz w:val="18"/>
                 <w:szCs w:val="18"/>
               </w:rPr>
-              <w:t xml:space="preserve">7–7</w:t>
+              <w:t xml:space="preserve">7</w:t>
             </w:r>
           </w:p>
         </w:tc>
@@ -4670,7 +4670,7 @@
           <w:sz w:val="20"/>
           <w:szCs w:val="20"/>
         </w:rPr>
-        <w:t xml:space="preserve">Fig. 3. Group-averaged coverage (left; bars are 95 % bootstrap intervals over held-out groups) and interval score relative to the oracle (right; lower is better; values beyond 3 or infinite are printed) at nominal coverage 0.90, means over five seeds. GC-D: proposed group-conformal calibration with diagnostic scaling.</w:t>
+        <w:t xml:space="preserve">Fig. 3. Group-averaged coverage (left; bars are 95 % bootstrap intervals over held-out groups) and interval score relative to the oracle (right; lower is better; ratios above 3 and infinite scores are plotted at 3 and labelled) at nominal coverage 0.90, means over five seeds. GC-D: proposed group-conformal calibration with diagnostic scaling.</w:t>
       </w:r>
     </w:p>
     <w:p>
@@ -4685,7 +4685,7 @@
           <w:sz w:val="20"/>
           <w:szCs w:val="20"/>
         </w:rPr>
-        <w:t xml:space="preserve">Table 2. Group-averaged empirical coverage at nominal coverage 0.90 (means over five seeds). M = mango, S = soil (LUCAS), C = corn.</w:t>
+        <w:t xml:space="preserve">Table 2. Group-averaged empirical coverage at nominal coverage 0.90 (means over five seeds). M = mango (instr. = instrument, pop. = population), S = soil (LUCAS), C = corn.</w:t>
       </w:r>
     </w:p>
     <w:tbl>
@@ -4844,7 +4844,7 @@
                 <w:sz w:val="16"/>
                 <w:szCs w:val="16"/>
               </w:rPr>
-              <w:t xml:space="preserve">M-instrument</w:t>
+              <w:t xml:space="preserve">M-instr.</w:t>
             </w:r>
           </w:p>
         </w:tc>
@@ -4877,7 +4877,7 @@
                 <w:sz w:val="16"/>
                 <w:szCs w:val="16"/>
               </w:rPr>
-              <w:t xml:space="preserve">M-population</w:t>
+              <w:t xml:space="preserve">M-pop.</w:t>
             </w:r>
           </w:p>
         </w:tc>
@@ -9598,7 +9598,7 @@
                 <w:sz w:val="16"/>
                 <w:szCs w:val="16"/>
               </w:rPr>
-              <w:t xml:space="preserve">M-instrument</w:t>
+              <w:t xml:space="preserve">M-instr.</w:t>
             </w:r>
           </w:p>
         </w:tc>
@@ -9631,7 +9631,7 @@
                 <w:sz w:val="16"/>
                 <w:szCs w:val="16"/>
               </w:rPr>
-              <w:t xml:space="preserve">M-population</w:t>
+              <w:t xml:space="preserve">M-pop.</w:t>
             </w:r>
           </w:p>
         </w:tc>
@@ -14218,7 +14218,7 @@
           <w:sz w:val="24"/>
           <w:szCs w:val="24"/>
         </w:rPr>
-        <w:t xml:space="preserve">Pre-registered hypothesis H2 required coverage between 0.87 and 0.95 on every task with at least ten training groups (mango, new instrument; mango, new population; soil, new region); it is supported. Paired over held-out groups (outer folds for the population task, where ten folds each hold out about 20 populations that share one model), GC-D had a lower interval score than SCP in 7 of 9 main scenarios, but the differences were significant after Holm correction only for soil, new region (Table 4). With five to seven seasons the smallest attainable two-sided Wilcoxon p-value is 0.0625 (n = 5) or 0.0156 (n = 7), so season-level comparisons cannot reach significance after correction for the 19 comparators; for new instruments (24 groups) the effect on the interval score was r = -0.39 (uncorrected p = 0.101). The evidence for GC-D is therefore the consistent direction of the coverage shift across all scenarios with several calibration groups and the pre-registered coverage criteria (H1, H2), rather than group-level significance of each pairwise difference.</w:t>
+        <w:t xml:space="preserve">Pre-registered hypothesis H2 required coverage between 0.87 and 0.95 on every task with at least ten training groups (mango, new instrument; mango, new population; soil, new region); it is supported. Paired over held-out groups (outer folds for the population task, where ten folds each hold out about 20 populations that share one model), GC-D had a lower interval score than SCP in 7 of 9 main scenarios, but the differences were significant after Holm correction only for soil, new region (Table 4). With five to seven seasons the smallest attainable two-sided Wilcoxon p-value is 0.0625 (n = 5) or 0.0156 (n = 7), so season-level comparisons cannot reach significance after correction for the 19 comparators; for new instruments (24 groups) the effect on the interval score was r = −0.39 (uncorrected p = 0.101). The evidence for GC-D is therefore the consistent direction of the coverage shift across all scenarios with several calibration groups and the pre-registered coverage criteria (H1, H2), rather than group-level significance of each pairwise difference.</w:t>
       </w:r>
     </w:p>
     <w:p>
@@ -14735,7 +14735,7 @@
                 <w:sz w:val="16"/>
                 <w:szCs w:val="16"/>
               </w:rPr>
-              <w:t xml:space="preserve">-0.36 (1.000)</w:t>
+              <w:t xml:space="preserve">−0.36 (1.000)</w:t>
             </w:r>
           </w:p>
         </w:tc>
@@ -14768,7 +14768,7 @@
                 <w:sz w:val="16"/>
                 <w:szCs w:val="16"/>
               </w:rPr>
-              <w:t xml:space="preserve">-0.36 (1.000)</w:t>
+              <w:t xml:space="preserve">−0.36 (1.000)</w:t>
             </w:r>
           </w:p>
         </w:tc>
@@ -14801,7 +14801,7 @@
                 <w:sz w:val="16"/>
                 <w:szCs w:val="16"/>
               </w:rPr>
-              <w:t xml:space="preserve">-0.36 (1.000)</w:t>
+              <w:t xml:space="preserve">−0.36 (1.000)</w:t>
             </w:r>
           </w:p>
         </w:tc>
@@ -14834,7 +14834,7 @@
                 <w:sz w:val="16"/>
                 <w:szCs w:val="16"/>
               </w:rPr>
-              <w:t xml:space="preserve">-0.43 (1.000)</w:t>
+              <w:t xml:space="preserve">−0.43 (1.000)</w:t>
             </w:r>
           </w:p>
         </w:tc>
@@ -14867,7 +14867,7 @@
                 <w:sz w:val="16"/>
                 <w:szCs w:val="16"/>
               </w:rPr>
-              <w:t xml:space="preserve">-0.64 (1.000)</w:t>
+              <w:t xml:space="preserve">−0.64 (1.000)</w:t>
             </w:r>
           </w:p>
         </w:tc>
@@ -14900,7 +14900,7 @@
                 <w:sz w:val="16"/>
                 <w:szCs w:val="16"/>
               </w:rPr>
-              <w:t xml:space="preserve">-0.50 (1.000)</w:t>
+              <w:t xml:space="preserve">−0.50 (1.000)</w:t>
             </w:r>
           </w:p>
         </w:tc>
@@ -14933,7 +14933,7 @@
                 <w:sz w:val="16"/>
                 <w:szCs w:val="16"/>
               </w:rPr>
-              <w:t xml:space="preserve">-0.36 (1.000)</w:t>
+              <w:t xml:space="preserve">−0.36 (1.000)</w:t>
             </w:r>
           </w:p>
         </w:tc>
@@ -15037,7 +15037,7 @@
                 <w:sz w:val="16"/>
                 <w:szCs w:val="16"/>
               </w:rPr>
-              <w:t xml:space="preserve">-0.47 (1.000)</w:t>
+              <w:t xml:space="preserve">−0.47 (1.000)</w:t>
             </w:r>
           </w:p>
         </w:tc>
@@ -15070,7 +15070,7 @@
                 <w:sz w:val="16"/>
                 <w:szCs w:val="16"/>
               </w:rPr>
-              <w:t xml:space="preserve">-0.47 (1.000)</w:t>
+              <w:t xml:space="preserve">−0.47 (1.000)</w:t>
             </w:r>
           </w:p>
         </w:tc>
@@ -15103,7 +15103,7 @@
                 <w:sz w:val="16"/>
                 <w:szCs w:val="16"/>
               </w:rPr>
-              <w:t xml:space="preserve">-0.47 (1.000)</w:t>
+              <w:t xml:space="preserve">−0.47 (1.000)</w:t>
             </w:r>
           </w:p>
         </w:tc>
@@ -15136,7 +15136,7 @@
                 <w:sz w:val="16"/>
                 <w:szCs w:val="16"/>
               </w:rPr>
-              <w:t xml:space="preserve">-0.60 (1.000)</w:t>
+              <w:t xml:space="preserve">−0.60 (1.000)</w:t>
             </w:r>
           </w:p>
         </w:tc>
@@ -15169,7 +15169,7 @@
                 <w:sz w:val="16"/>
                 <w:szCs w:val="16"/>
               </w:rPr>
-              <w:t xml:space="preserve">-1.00 (1.000)</w:t>
+              <w:t xml:space="preserve">−1.00 (1.000)</w:t>
             </w:r>
           </w:p>
         </w:tc>
@@ -15202,7 +15202,7 @@
                 <w:sz w:val="16"/>
                 <w:szCs w:val="16"/>
               </w:rPr>
-              <w:t xml:space="preserve">-0.87 (1.000)</w:t>
+              <w:t xml:space="preserve">−0.87 (1.000)</w:t>
             </w:r>
           </w:p>
         </w:tc>
@@ -15235,7 +15235,7 @@
                 <w:sz w:val="16"/>
                 <w:szCs w:val="16"/>
               </w:rPr>
-              <w:t xml:space="preserve">-0.47 (1.000)</w:t>
+              <w:t xml:space="preserve">−0.47 (1.000)</w:t>
             </w:r>
           </w:p>
         </w:tc>
@@ -15273,7 +15273,7 @@
                 <w:sz w:val="16"/>
                 <w:szCs w:val="16"/>
               </w:rPr>
-              <w:t xml:space="preserve">M-instrument</w:t>
+              <w:t xml:space="preserve">M-instr.</w:t>
             </w:r>
           </w:p>
         </w:tc>
@@ -15339,7 +15339,7 @@
                 <w:sz w:val="16"/>
                 <w:szCs w:val="16"/>
               </w:rPr>
-              <w:t xml:space="preserve">-0.39 (1.000)</w:t>
+              <w:t xml:space="preserve">−0.39 (1.000)</w:t>
             </w:r>
           </w:p>
         </w:tc>
@@ -15372,7 +15372,7 @@
                 <w:sz w:val="16"/>
                 <w:szCs w:val="16"/>
               </w:rPr>
-              <w:t xml:space="preserve">-0.31 (1.000)</w:t>
+              <w:t xml:space="preserve">−0.31 (1.000)</w:t>
             </w:r>
           </w:p>
         </w:tc>
@@ -15405,7 +15405,7 @@
                 <w:sz w:val="16"/>
                 <w:szCs w:val="16"/>
               </w:rPr>
-              <w:t xml:space="preserve">-0.37 (1.000)</w:t>
+              <w:t xml:space="preserve">−0.37 (1.000)</w:t>
             </w:r>
           </w:p>
         </w:tc>
@@ -15438,7 +15438,7 @@
                 <w:sz w:val="16"/>
                 <w:szCs w:val="16"/>
               </w:rPr>
-              <w:t xml:space="preserve">-0.39 (1.000)</w:t>
+              <w:t xml:space="preserve">−0.39 (1.000)</w:t>
             </w:r>
           </w:p>
         </w:tc>
@@ -15471,7 +15471,7 @@
                 <w:sz w:val="16"/>
                 <w:szCs w:val="16"/>
               </w:rPr>
-              <w:t xml:space="preserve">-0.65 (0.065)</w:t>
+              <w:t xml:space="preserve">−0.65 (0.065)</w:t>
             </w:r>
           </w:p>
         </w:tc>
@@ -15504,7 +15504,7 @@
                 <w:sz w:val="16"/>
                 <w:szCs w:val="16"/>
               </w:rPr>
-              <w:t xml:space="preserve">-1.00 (&lt;0.001)</w:t>
+              <w:t xml:space="preserve">−1.00 (&lt;0.001)</w:t>
             </w:r>
           </w:p>
         </w:tc>
@@ -15537,7 +15537,7 @@
                 <w:sz w:val="16"/>
                 <w:szCs w:val="16"/>
               </w:rPr>
-              <w:t xml:space="preserve">-0.27 (1.000)</w:t>
+              <w:t xml:space="preserve">−0.27 (1.000)</w:t>
             </w:r>
           </w:p>
         </w:tc>
@@ -15575,7 +15575,7 @@
                 <w:sz w:val="16"/>
                 <w:szCs w:val="16"/>
               </w:rPr>
-              <w:t xml:space="preserve">M-population</w:t>
+              <w:t xml:space="preserve">M-pop.</w:t>
             </w:r>
           </w:p>
         </w:tc>
@@ -15641,7 +15641,7 @@
                 <w:sz w:val="16"/>
                 <w:szCs w:val="16"/>
               </w:rPr>
-              <w:t xml:space="preserve">-0.71 (0.732)</w:t>
+              <w:t xml:space="preserve">−0.71 (0.732)</w:t>
             </w:r>
           </w:p>
         </w:tc>
@@ -15674,7 +15674,7 @@
                 <w:sz w:val="16"/>
                 <w:szCs w:val="16"/>
               </w:rPr>
-              <w:t xml:space="preserve">-0.56 (1.000)</w:t>
+              <w:t xml:space="preserve">−0.56 (1.000)</w:t>
             </w:r>
           </w:p>
         </w:tc>
@@ -15707,7 +15707,7 @@
                 <w:sz w:val="16"/>
                 <w:szCs w:val="16"/>
               </w:rPr>
-              <w:t xml:space="preserve">-0.56 (1.000)</w:t>
+              <w:t xml:space="preserve">−0.56 (1.000)</w:t>
             </w:r>
           </w:p>
         </w:tc>
@@ -15740,7 +15740,7 @@
                 <w:sz w:val="16"/>
                 <w:szCs w:val="16"/>
               </w:rPr>
-              <w:t xml:space="preserve">-0.67 (0.773)</w:t>
+              <w:t xml:space="preserve">−0.67 (0.773)</w:t>
             </w:r>
           </w:p>
         </w:tc>
@@ -15773,7 +15773,7 @@
                 <w:sz w:val="16"/>
                 <w:szCs w:val="16"/>
               </w:rPr>
-              <w:t xml:space="preserve">-0.71 (0.732)</w:t>
+              <w:t xml:space="preserve">−0.71 (0.732)</w:t>
             </w:r>
           </w:p>
         </w:tc>
@@ -15806,7 +15806,7 @@
                 <w:sz w:val="16"/>
                 <w:szCs w:val="16"/>
               </w:rPr>
-              <w:t xml:space="preserve">-1.00 (0.039)</w:t>
+              <w:t xml:space="preserve">−1.00 (0.039)</w:t>
             </w:r>
           </w:p>
         </w:tc>
@@ -15839,7 +15839,7 @@
                 <w:sz w:val="16"/>
                 <w:szCs w:val="16"/>
               </w:rPr>
-              <w:t xml:space="preserve">-0.64 (0.924)</w:t>
+              <w:t xml:space="preserve">−0.64 (0.924)</w:t>
             </w:r>
           </w:p>
         </w:tc>
@@ -15943,7 +15943,7 @@
                 <w:sz w:val="16"/>
                 <w:szCs w:val="16"/>
               </w:rPr>
-              <w:t xml:space="preserve">-0.83 (0.001)</w:t>
+              <w:t xml:space="preserve">−0.83 (0.001)</w:t>
             </w:r>
           </w:p>
         </w:tc>
@@ -15976,7 +15976,7 @@
                 <w:sz w:val="16"/>
                 <w:szCs w:val="16"/>
               </w:rPr>
-              <w:t xml:space="preserve">-0.73 (0.005)</w:t>
+              <w:t xml:space="preserve">−0.73 (0.005)</w:t>
             </w:r>
           </w:p>
         </w:tc>
@@ -16009,7 +16009,7 @@
                 <w:sz w:val="16"/>
                 <w:szCs w:val="16"/>
               </w:rPr>
-              <w:t xml:space="preserve">-0.46 (0.162)</w:t>
+              <w:t xml:space="preserve">−0.46 (0.162)</w:t>
             </w:r>
           </w:p>
         </w:tc>
@@ -16042,7 +16042,7 @@
                 <w:sz w:val="16"/>
                 <w:szCs w:val="16"/>
               </w:rPr>
-              <w:t xml:space="preserve">-0.79 (0.002)</w:t>
+              <w:t xml:space="preserve">−0.79 (0.002)</w:t>
             </w:r>
           </w:p>
         </w:tc>
@@ -16108,7 +16108,7 @@
                 <w:sz w:val="16"/>
                 <w:szCs w:val="16"/>
               </w:rPr>
-              <w:t xml:space="preserve">-0.91 (&lt;0.001)</w:t>
+              <w:t xml:space="preserve">−0.91 (&lt;0.001)</w:t>
             </w:r>
           </w:p>
         </w:tc>
@@ -16141,7 +16141,7 @@
                 <w:sz w:val="16"/>
                 <w:szCs w:val="16"/>
               </w:rPr>
-              <w:t xml:space="preserve">-0.64 (0.016)</w:t>
+              <w:t xml:space="preserve">−0.64 (0.016)</w:t>
             </w:r>
           </w:p>
         </w:tc>
@@ -16410,7 +16410,7 @@
                 <w:sz w:val="16"/>
                 <w:szCs w:val="16"/>
               </w:rPr>
-              <w:t xml:space="preserve">-0.99 (&lt;0.001)</w:t>
+              <w:t xml:space="preserve">−0.99 (&lt;0.001)</w:t>
             </w:r>
           </w:p>
         </w:tc>
@@ -16547,7 +16547,7 @@
                 <w:sz w:val="16"/>
                 <w:szCs w:val="16"/>
               </w:rPr>
-              <w:t xml:space="preserve">-0.23 (1.000)</w:t>
+              <w:t xml:space="preserve">−0.23 (1.000)</w:t>
             </w:r>
           </w:p>
         </w:tc>
@@ -16712,7 +16712,7 @@
                 <w:sz w:val="16"/>
                 <w:szCs w:val="16"/>
               </w:rPr>
-              <w:t xml:space="preserve">-0.99 (&lt;0.001)</w:t>
+              <w:t xml:space="preserve">−0.99 (&lt;0.001)</w:t>
             </w:r>
           </w:p>
         </w:tc>
@@ -16849,7 +16849,7 @@
                 <w:sz w:val="16"/>
                 <w:szCs w:val="16"/>
               </w:rPr>
-              <w:t xml:space="preserve">-0.10 (1.000)</w:t>
+              <w:t xml:space="preserve">−0.10 (1.000)</w:t>
             </w:r>
           </w:p>
         </w:tc>
@@ -17014,7 +17014,7 @@
                 <w:sz w:val="16"/>
                 <w:szCs w:val="16"/>
               </w:rPr>
-              <w:t xml:space="preserve">-1.00 (&lt;0.001)</w:t>
+              <w:t xml:space="preserve">−1.00 (&lt;0.001)</w:t>
             </w:r>
           </w:p>
         </w:tc>
@@ -17151,7 +17151,7 @@
                 <w:sz w:val="16"/>
                 <w:szCs w:val="16"/>
               </w:rPr>
-              <w:t xml:space="preserve">-0.20 (1.000)</w:t>
+              <w:t xml:space="preserve">−0.20 (1.000)</w:t>
             </w:r>
           </w:p>
         </w:tc>
@@ -17316,7 +17316,7 @@
                 <w:sz w:val="16"/>
                 <w:szCs w:val="16"/>
               </w:rPr>
-              <w:t xml:space="preserve">-1.00 (&lt;0.001)</w:t>
+              <w:t xml:space="preserve">−1.00 (&lt;0.001)</w:t>
             </w:r>
           </w:p>
         </w:tc>
@@ -17453,7 +17453,7 @@
                 <w:sz w:val="16"/>
                 <w:szCs w:val="16"/>
               </w:rPr>
-              <w:t xml:space="preserve">-1.00 (1.000)</w:t>
+              <w:t xml:space="preserve">−1.00 (1.000)</w:t>
             </w:r>
           </w:p>
         </w:tc>
@@ -17486,7 +17486,7 @@
                 <w:sz w:val="16"/>
                 <w:szCs w:val="16"/>
               </w:rPr>
-              <w:t xml:space="preserve">-1.00 (1.000)</w:t>
+              <w:t xml:space="preserve">−1.00 (1.000)</w:t>
             </w:r>
           </w:p>
         </w:tc>
@@ -17519,7 +17519,7 @@
                 <w:sz w:val="16"/>
                 <w:szCs w:val="16"/>
               </w:rPr>
-              <w:t xml:space="preserve">-1.00 (1.000)</w:t>
+              <w:t xml:space="preserve">−1.00 (1.000)</w:t>
             </w:r>
           </w:p>
         </w:tc>
@@ -17552,7 +17552,7 @@
                 <w:sz w:val="16"/>
                 <w:szCs w:val="16"/>
               </w:rPr>
-              <w:t xml:space="preserve">-1.00 (1.000)</w:t>
+              <w:t xml:space="preserve">−1.00 (1.000)</w:t>
             </w:r>
           </w:p>
         </w:tc>
@@ -17618,7 +17618,7 @@
                 <w:sz w:val="16"/>
                 <w:szCs w:val="16"/>
               </w:rPr>
-              <w:t xml:space="preserve">-1.00 (1.000)</w:t>
+              <w:t xml:space="preserve">−1.00 (1.000)</w:t>
             </w:r>
           </w:p>
         </w:tc>
@@ -17651,7 +17651,7 @@
                 <w:sz w:val="16"/>
                 <w:szCs w:val="16"/>
               </w:rPr>
-              <w:t xml:space="preserve">-1.00 (1.000)</w:t>
+              <w:t xml:space="preserve">−1.00 (1.000)</w:t>
             </w:r>
           </w:p>
         </w:tc>
@@ -17755,7 +17755,7 @@
                 <w:sz w:val="16"/>
                 <w:szCs w:val="16"/>
               </w:rPr>
-              <w:t xml:space="preserve">-1.00 (1.000)</w:t>
+              <w:t xml:space="preserve">−1.00 (1.000)</w:t>
             </w:r>
           </w:p>
         </w:tc>
@@ -17788,7 +17788,7 @@
                 <w:sz w:val="16"/>
                 <w:szCs w:val="16"/>
               </w:rPr>
-              <w:t xml:space="preserve">-1.00 (1.000)</w:t>
+              <w:t xml:space="preserve">−1.00 (1.000)</w:t>
             </w:r>
           </w:p>
         </w:tc>
@@ -17821,7 +17821,7 @@
                 <w:sz w:val="16"/>
                 <w:szCs w:val="16"/>
               </w:rPr>
-              <w:t xml:space="preserve">-1.00 (1.000)</w:t>
+              <w:t xml:space="preserve">−1.00 (1.000)</w:t>
             </w:r>
           </w:p>
         </w:tc>
@@ -17854,7 +17854,7 @@
                 <w:sz w:val="16"/>
                 <w:szCs w:val="16"/>
               </w:rPr>
-              <w:t xml:space="preserve">-1.00 (1.000)</w:t>
+              <w:t xml:space="preserve">−1.00 (1.000)</w:t>
             </w:r>
           </w:p>
         </w:tc>
@@ -17887,7 +17887,7 @@
                 <w:sz w:val="16"/>
                 <w:szCs w:val="16"/>
               </w:rPr>
-              <w:t xml:space="preserve">-1.00 (1.000)</w:t>
+              <w:t xml:space="preserve">−1.00 (1.000)</w:t>
             </w:r>
           </w:p>
         </w:tc>
@@ -17920,7 +17920,7 @@
                 <w:sz w:val="16"/>
                 <w:szCs w:val="16"/>
               </w:rPr>
-              <w:t xml:space="preserve">-1.00 (1.000)</w:t>
+              <w:t xml:space="preserve">−1.00 (1.000)</w:t>
             </w:r>
           </w:p>
         </w:tc>
@@ -17953,7 +17953,7 @@
                 <w:sz w:val="16"/>
                 <w:szCs w:val="16"/>
               </w:rPr>
-              <w:t xml:space="preserve">-1.00 (1.000)</w:t>
+              <w:t xml:space="preserve">−1.00 (1.000)</w:t>
             </w:r>
           </w:p>
         </w:tc>
@@ -18057,7 +18057,7 @@
                 <w:sz w:val="16"/>
                 <w:szCs w:val="16"/>
               </w:rPr>
-              <w:t xml:space="preserve">-1.00 (1.000)</w:t>
+              <w:t xml:space="preserve">−1.00 (1.000)</w:t>
             </w:r>
           </w:p>
         </w:tc>
@@ -18090,7 +18090,7 @@
                 <w:sz w:val="16"/>
                 <w:szCs w:val="16"/>
               </w:rPr>
-              <w:t xml:space="preserve">-1.00 (1.000)</w:t>
+              <w:t xml:space="preserve">−1.00 (1.000)</w:t>
             </w:r>
           </w:p>
         </w:tc>
@@ -18123,7 +18123,7 @@
                 <w:sz w:val="16"/>
                 <w:szCs w:val="16"/>
               </w:rPr>
-              <w:t xml:space="preserve">-1.00 (1.000)</w:t>
+              <w:t xml:space="preserve">−1.00 (1.000)</w:t>
             </w:r>
           </w:p>
         </w:tc>
@@ -18156,7 +18156,7 @@
                 <w:sz w:val="16"/>
                 <w:szCs w:val="16"/>
               </w:rPr>
-              <w:t xml:space="preserve">-1.00 (1.000)</w:t>
+              <w:t xml:space="preserve">−1.00 (1.000)</w:t>
             </w:r>
           </w:p>
         </w:tc>
@@ -18189,7 +18189,7 @@
                 <w:sz w:val="16"/>
                 <w:szCs w:val="16"/>
               </w:rPr>
-              <w:t xml:space="preserve">-1.00 (1.000)</w:t>
+              <w:t xml:space="preserve">−1.00 (1.000)</w:t>
             </w:r>
           </w:p>
         </w:tc>
@@ -18222,7 +18222,7 @@
                 <w:sz w:val="16"/>
                 <w:szCs w:val="16"/>
               </w:rPr>
-              <w:t xml:space="preserve">-1.00 (1.000)</w:t>
+              <w:t xml:space="preserve">−1.00 (1.000)</w:t>
             </w:r>
           </w:p>
         </w:tc>
@@ -18255,7 +18255,7 @@
                 <w:sz w:val="16"/>
                 <w:szCs w:val="16"/>
               </w:rPr>
-              <w:t xml:space="preserve">-0.33 (1.000)</w:t>
+              <w:t xml:space="preserve">−0.33 (1.000)</w:t>
             </w:r>
           </w:p>
         </w:tc>
@@ -18646,7 +18646,7 @@
           <w:sz w:val="24"/>
           <w:szCs w:val="24"/>
         </w:rPr>
-        <w:t xml:space="preserve">Coverage failures were concentrated in identifiable spectra and samples (Fig. 7; the Q-residual ratio is Q(x)/Q̃, the residual of a test spectrum relative to the median training residual). For new seasons, SCP covered 0.947 of the spectra with the smallest Q residuals but only 0.694 in the highest Q decile; GC-D covered 0.946 and 0.888, and G-W-A (absolute scores) 0.780 in the highest decile, which shows how the diagnostic scale moves width to atypical spectra. All methods under-covered at the extremes of the DM range (lowest decile: SCP 0.776, GC-D 0.865), where PLS predictions regress towards the mean. Across new instruments, per-instrument coverage of GC-D fell with the absolute mean prediction bias of that instrument (Pearson r = -0.73); the worst instrument (bias -2.45 % DM) was covered 0.356. Such a large instrument offset is better corrected by bias adjustment with a few reference samples than absorbed into wider intervals. For new populations, every method failed on the same few lots; the worst (population 114500, 80 spectra, green 'Kensington Pride' fruit of 2020) had a mean DM far below the data-set mean and a prediction bias of +3.33 % DM, so that GC-D covered 0.013 of its spectra and the oracle, which sees its labels, remained the only method close to nominal. Pooled over all spectra (cluster bootstrap over 10560 fruit), new-season coverage was 0.859 [0.853, 0.865] for SCP and 0.927 [0.923, 0.932] for GC-D; the difference from the group-averaged values reflects unequal season sizes: GC-D over-covered the large seasons whose spectra resembled the calibration data (e.g. 2016 and 2017, Fig. 4), which is the price of calibrating to the between-season error distribution.</w:t>
+        <w:t xml:space="preserve">Coverage failures were concentrated in identifiable spectra and samples (Fig. 7; the Q-residual ratio is Q(x)/Q̃, the residual of a test spectrum relative to the median training residual). For new seasons, SCP covered 0.947 of the spectra with the smallest Q residuals but only 0.694 in the highest Q decile; GC-D covered 0.946 and 0.888, and G-W-A (absolute scores) 0.780 in the highest decile, which shows how the diagnostic scale moves width to atypical spectra. All methods under-covered at the extremes of the DM range (lowest decile: SCP 0.776, GC-D 0.865), where PLS predictions regress towards the mean. Across new instruments, per-instrument coverage of GC-D fell with the absolute mean prediction bias of that instrument (Pearson r = −0.73); the worst instrument (bias −2.45 % DM) was covered 0.356. Such a large instrument offset is better corrected by bias adjustment with a few reference samples than absorbed into wider intervals. For new populations, every method failed on the same few lots; the worst (population 114500, 80 spectra, green 'Kensington Pride' fruit of 2020) had a mean DM far below the data-set mean and a prediction bias of +3.33 % DM, so that GC-D covered 0.013 of its spectra and the oracle, which sees its labels, remained the only method close to nominal. Pooled over all spectra (cluster bootstrap over 10560 fruit), new-season coverage was 0.859 [0.853, 0.865] for SCP and 0.927 [0.923, 0.932] for GC-D; the difference from the group-averaged values reflects unequal season sizes: GC-D over-covered the large seasons whose spectra resembled the calibration data (e.g. 2016 and 2017, Fig. 4), which is the price of calibrating to the between-season error distribution.</w:t>
       </w:r>
     </w:p>
     <w:p>
@@ -18660,7 +18660,7 @@
           <w:sz w:val="24"/>
           <w:szCs w:val="24"/>
         </w:rPr>
-        <w:t xml:space="preserve">For a harvest decision 'DM ≥ L', accepting a fruit only when the lower interval limit exceeds L is a one-sided 95 % statement. For new seasons and L = 16 % DM, the share of accepted spectra whose true DM was below L was 0.041 with SCP, 0.039 with the classical interval and 0.021 with GC-D; at L = 17 % the values were 0.057, 0.056 and 0.024 (Fig. 8). The price is a lower yield of accepted compliant fruit (0.342 vs 0.434 at L = 16 %), slightly below that of the oracle (0.375). The false-acceptance rate of random calibration exceeded its nominal 5 % at L = 17 %, that of GC-D did not.</w:t>
+        <w:t xml:space="preserve">For a harvest decision 'DM ≥ L', accepting a fruit only when the lower interval limit exceeds L is a one-sided 95 % statement. For new seasons and L = 16 % DM, the share of accepted spectra whose true DM was below L was 0.041 with SCP, 0.039 with the classical interval and 0.021 with GC-D; at L = 17 % the values were 0.057, 0.056 and 0.024 (Fig. 8). The price is a lower yield of accepted compliant fruit (0.342 vs 0.434 at L = 16 %), slightly below that of the oracle (0.375). The false-acceptance rate of random calibration exceeded its nominal 5 % at L = 17 %; that of GC-D did not.</w:t>
       </w:r>
     </w:p>
     <w:p>
@@ -18906,7 +18906,7 @@
           <w:sz w:val="24"/>
           <w:szCs w:val="24"/>
         </w:rPr>
-        <w:t xml:space="preserve">All methods assume that the new group is exchangeable with the calibration groups. A systematic trend over seasons, a new cultivar or a new instrument type outside the calibration population is not covered.</w:t>
+        <w:t xml:space="preserve">All methods assume that the new group is exchangeable with the calibration groups. A trend over seasons that goes beyond the variation among past seasons, or a cultivar or instrument type unlike any in the calibration population, is not covered (the new cultivars of Section 4.6 were measured in seasons and on instruments represented in training).</w:t>
       </w:r>
     </w:p>
     <w:p>

</xml_diff>